<commit_message>
feat: configure signer title and date format for 213, add bi_thu_lcd and bi_thu_chi_doan fields with smart fallbacks, and support ngay_phan_cong for Mau 11
</commit_message>
<xml_diff>
--- a/public/4. Nghị quyết Chi Đoàn.docx
+++ b/public/4. Nghị quyết Chi Đoàn.docx
@@ -418,7 +418,21 @@
         </w:rPr>
       </w:pPr>
       <w:r>
-        <w:t>Ban Chấp hành Chi Đoàn {{lop}} họp ngày {{ngay_hop_chi_doan_d}} tháng {{ngay_hop_chi_doan_m}} năm {{ngay_hop_chi_doan_y}} xét thấy:</w:t>
+        <w:t xml:space="preserve">Ban Chấp hành Chi Đoàn {{lop}} họp </w:t>
+      </w:r>
+      <w:proofErr w:type="gramStart"/>
+      <w:r>
+        <w:t>ngày</w:t>
+      </w:r>
+      <w:r>
+        <w:t xml:space="preserve">  </w:t>
+      </w:r>
+      <w:r>
+        <w:t>tháng</w:t>
+      </w:r>
+      <w:proofErr w:type="gramEnd"/>
+      <w:r>
+        <w:t xml:space="preserve">  năm {{ngay_hop_chi_doan_y}} xét thấy:</w:t>
       </w:r>
     </w:p>
     <w:p>
@@ -723,7 +737,15 @@
         </w:rPr>
       </w:pPr>
       <w:r>
-        <w:t>Biểu quyết thông qua với sự tán thành của {{tan_thanh_chi_doan}} đồng chí Ủy viên Ban Chấp hành Chi Đoàn (đạt {{ti_le_chi_doan}}%); số không tán thành {{khong_tan_thanh_chi_doan}} đồng chí.</w:t>
+        <w:t>Biểu quyết thông qua với sự tán thành của {{tan_thanh_chi_doan}} đồng chí Ủy viên Ban Chấp hành Chi Đoàn (đạt {{ti_le_chi_doan</w:t>
+      </w:r>
+      <w:proofErr w:type="gramStart"/>
+      <w:r>
+        <w:t>}}%</w:t>
+      </w:r>
+      <w:proofErr w:type="gramEnd"/>
+      <w:r>
+        <w:t>); số không tán thành {{khong_tan_thanh_chi_doan}} đồng chí.</w:t>
       </w:r>
     </w:p>
     <w:p>
@@ -808,7 +830,21 @@
                 <w:rFonts w:eastAsia="Calibri"/>
                 <w:b/>
               </w:rPr>
-              <w:t xml:space="preserve">CHẤP </w:t>
+              <w:t>CHẤP</w:t>
+            </w:r>
+            <w:r>
+              <w:rPr>
+                <w:rFonts w:eastAsia="Calibri"/>
+                <w:b/>
+              </w:rPr>
+              <w:t xml:space="preserve"> HÀNH</w:t>
+            </w:r>
+            <w:r>
+              <w:rPr>
+                <w:rFonts w:eastAsia="Calibri"/>
+                <w:b/>
+              </w:rPr>
+              <w:t xml:space="preserve"> </w:t>
             </w:r>
             <w:r>
               <w:rPr>
@@ -1303,6 +1339,7 @@
   <w:style w:type="character" w:default="1" w:styleId="DefaultParagraphFont">
     <w:name w:val="Default Paragraph Font"/>
     <w:uiPriority w:val="1"/>
+    <w:semiHidden/>
     <w:unhideWhenUsed/>
   </w:style>
   <w:style w:type="table" w:default="1" w:styleId="TableNormal">

</xml_diff>